<commit_message>
fix(agenda): correcciones de la prueba del dueno: horario propuesto, dias cerrados, cirugia, horarios por nivel, rojo a urgencias y plazo de cambios (HU-4.13, HU-7.4, RN-G18, RN-430)
</commit_message>
<xml_diff>
--- a/public/docs/descargas/mer.docx
+++ b/public/docs/descargas/mer.docx
@@ -85,7 +85,7 @@
           <w:noProof/>
         </w:rPr>
         <w:drawing>
-          <wp:inline distT="0" distB="0" distL="0" distR="0" wp14:anchorId="632F3101" wp14:editId="2477D200">
+          <wp:inline distT="0" distB="0" distL="0" distR="0" wp14:anchorId="5B8BAB8B" wp14:editId="5B8BAB8C">
             <wp:extent cx="395999" cy="405503"/>
             <wp:effectExtent l="0" t="0" r="0" b="0"/>
             <wp:docPr id="10" name="Picture"/>
@@ -221,7 +221,7 @@
               <w:pStyle w:val="Celda"/>
             </w:pPr>
             <w:r>
-              <w:t>26/10/2026</w:t>
+              <w:t>29/10/2026</w:t>
             </w:r>
           </w:p>
         </w:tc>
@@ -401,7 +401,7 @@
       <w:r>
         <w:fldChar w:fldCharType="separate"/>
       </w:r>
-      <w:hyperlink w:anchor="_Toc243902364" w:history="1">
+      <w:hyperlink w:anchor="_Toc244209244" w:history="1">
         <w:r>
           <w:rPr>
             <w:rStyle w:val="Hipervnculo"/>
@@ -428,7 +428,7 @@
             <w:noProof/>
             <w:webHidden/>
           </w:rPr>
-          <w:instrText xml:space="preserve"> PAGEREF _Toc243902364 \h </w:instrText>
+          <w:instrText xml:space="preserve"> PAGEREF _Toc244209244 \h </w:instrText>
         </w:r>
         <w:r>
           <w:rPr>
@@ -474,7 +474,7 @@
           <w14:ligatures w14:val="standardContextual"/>
         </w:rPr>
       </w:pPr>
-      <w:hyperlink w:anchor="_Toc243902365" w:history="1">
+      <w:hyperlink w:anchor="_Toc244209245" w:history="1">
         <w:r>
           <w:rPr>
             <w:rStyle w:val="Hipervnculo"/>
@@ -501,7 +501,7 @@
             <w:noProof/>
             <w:webHidden/>
           </w:rPr>
-          <w:instrText xml:space="preserve"> PAGEREF _Toc243902365 \h </w:instrText>
+          <w:instrText xml:space="preserve"> PAGEREF _Toc244209245 \h </w:instrText>
         </w:r>
         <w:r>
           <w:rPr>
@@ -547,7 +547,7 @@
           <w14:ligatures w14:val="standardContextual"/>
         </w:rPr>
       </w:pPr>
-      <w:hyperlink w:anchor="_Toc243902366" w:history="1">
+      <w:hyperlink w:anchor="_Toc244209246" w:history="1">
         <w:r>
           <w:rPr>
             <w:rStyle w:val="Hipervnculo"/>
@@ -574,7 +574,7 @@
             <w:noProof/>
             <w:webHidden/>
           </w:rPr>
-          <w:instrText xml:space="preserve"> PAGEREF _Toc243902366 \h </w:instrText>
+          <w:instrText xml:space="preserve"> PAGEREF _Toc244209246 \h </w:instrText>
         </w:r>
         <w:r>
           <w:rPr>
@@ -617,7 +617,7 @@
           <w14:ligatures w14:val="standardContextual"/>
         </w:rPr>
       </w:pPr>
-      <w:hyperlink w:anchor="_Toc243902367" w:history="1">
+      <w:hyperlink w:anchor="_Toc244209247" w:history="1">
         <w:r>
           <w:rPr>
             <w:rStyle w:val="Hipervnculo"/>
@@ -644,7 +644,7 @@
             <w:noProof/>
             <w:webHidden/>
           </w:rPr>
-          <w:instrText xml:space="preserve"> PAGEREF _Toc243902367 \h </w:instrText>
+          <w:instrText xml:space="preserve"> PAGEREF _Toc244209247 \h </w:instrText>
         </w:r>
         <w:r>
           <w:rPr>
@@ -687,7 +687,7 @@
           <w14:ligatures w14:val="standardContextual"/>
         </w:rPr>
       </w:pPr>
-      <w:hyperlink w:anchor="_Toc243902368" w:history="1">
+      <w:hyperlink w:anchor="_Toc244209248" w:history="1">
         <w:r>
           <w:rPr>
             <w:rStyle w:val="Hipervnculo"/>
@@ -714,7 +714,7 @@
             <w:noProof/>
             <w:webHidden/>
           </w:rPr>
-          <w:instrText xml:space="preserve"> PAGEREF _Toc243902368 \h </w:instrText>
+          <w:instrText xml:space="preserve"> PAGEREF _Toc244209248 \h </w:instrText>
         </w:r>
         <w:r>
           <w:rPr>
@@ -757,7 +757,7 @@
           <w14:ligatures w14:val="standardContextual"/>
         </w:rPr>
       </w:pPr>
-      <w:hyperlink w:anchor="_Toc243902369" w:history="1">
+      <w:hyperlink w:anchor="_Toc244209249" w:history="1">
         <w:r>
           <w:rPr>
             <w:rStyle w:val="Hipervnculo"/>
@@ -784,7 +784,7 @@
             <w:noProof/>
             <w:webHidden/>
           </w:rPr>
-          <w:instrText xml:space="preserve"> PAGEREF _Toc243902369 \h </w:instrText>
+          <w:instrText xml:space="preserve"> PAGEREF _Toc244209249 \h </w:instrText>
         </w:r>
         <w:r>
           <w:rPr>
@@ -827,7 +827,7 @@
           <w14:ligatures w14:val="standardContextual"/>
         </w:rPr>
       </w:pPr>
-      <w:hyperlink w:anchor="_Toc243902370" w:history="1">
+      <w:hyperlink w:anchor="_Toc244209250" w:history="1">
         <w:r>
           <w:rPr>
             <w:rStyle w:val="Hipervnculo"/>
@@ -854,7 +854,7 @@
             <w:noProof/>
             <w:webHidden/>
           </w:rPr>
-          <w:instrText xml:space="preserve"> PAGEREF _Toc243902370 \h </w:instrText>
+          <w:instrText xml:space="preserve"> PAGEREF _Toc244209250 \h </w:instrText>
         </w:r>
         <w:r>
           <w:rPr>
@@ -897,7 +897,7 @@
           <w14:ligatures w14:val="standardContextual"/>
         </w:rPr>
       </w:pPr>
-      <w:hyperlink w:anchor="_Toc243902371" w:history="1">
+      <w:hyperlink w:anchor="_Toc244209251" w:history="1">
         <w:r>
           <w:rPr>
             <w:rStyle w:val="Hipervnculo"/>
@@ -924,7 +924,7 @@
             <w:noProof/>
             <w:webHidden/>
           </w:rPr>
-          <w:instrText xml:space="preserve"> PAGEREF _Toc243902371 \h </w:instrText>
+          <w:instrText xml:space="preserve"> PAGEREF _Toc244209251 \h </w:instrText>
         </w:r>
         <w:r>
           <w:rPr>
@@ -967,7 +967,7 @@
           <w14:ligatures w14:val="standardContextual"/>
         </w:rPr>
       </w:pPr>
-      <w:hyperlink w:anchor="_Toc243902372" w:history="1">
+      <w:hyperlink w:anchor="_Toc244209252" w:history="1">
         <w:r>
           <w:rPr>
             <w:rStyle w:val="Hipervnculo"/>
@@ -994,7 +994,7 @@
             <w:noProof/>
             <w:webHidden/>
           </w:rPr>
-          <w:instrText xml:space="preserve"> PAGEREF _Toc243902372 \h </w:instrText>
+          <w:instrText xml:space="preserve"> PAGEREF _Toc244209252 \h </w:instrText>
         </w:r>
         <w:r>
           <w:rPr>
@@ -1037,7 +1037,7 @@
           <w14:ligatures w14:val="standardContextual"/>
         </w:rPr>
       </w:pPr>
-      <w:hyperlink w:anchor="_Toc243902373" w:history="1">
+      <w:hyperlink w:anchor="_Toc244209253" w:history="1">
         <w:r>
           <w:rPr>
             <w:rStyle w:val="Hipervnculo"/>
@@ -1064,7 +1064,7 @@
             <w:noProof/>
             <w:webHidden/>
           </w:rPr>
-          <w:instrText xml:space="preserve"> PAGEREF _Toc243902373 \h </w:instrText>
+          <w:instrText xml:space="preserve"> PAGEREF _Toc244209253 \h </w:instrText>
         </w:r>
         <w:r>
           <w:rPr>
@@ -1107,7 +1107,7 @@
           <w14:ligatures w14:val="standardContextual"/>
         </w:rPr>
       </w:pPr>
-      <w:hyperlink w:anchor="_Toc243902374" w:history="1">
+      <w:hyperlink w:anchor="_Toc244209254" w:history="1">
         <w:r>
           <w:rPr>
             <w:rStyle w:val="Hipervnculo"/>
@@ -1134,7 +1134,7 @@
             <w:noProof/>
             <w:webHidden/>
           </w:rPr>
-          <w:instrText xml:space="preserve"> PAGEREF _Toc243902374 \h </w:instrText>
+          <w:instrText xml:space="preserve"> PAGEREF _Toc244209254 \h </w:instrText>
         </w:r>
         <w:r>
           <w:rPr>
@@ -1177,7 +1177,7 @@
           <w14:ligatures w14:val="standardContextual"/>
         </w:rPr>
       </w:pPr>
-      <w:hyperlink w:anchor="_Toc243902375" w:history="1">
+      <w:hyperlink w:anchor="_Toc244209255" w:history="1">
         <w:r>
           <w:rPr>
             <w:rStyle w:val="Hipervnculo"/>
@@ -1204,7 +1204,7 @@
             <w:noProof/>
             <w:webHidden/>
           </w:rPr>
-          <w:instrText xml:space="preserve"> PAGEREF _Toc243902375 \h </w:instrText>
+          <w:instrText xml:space="preserve"> PAGEREF _Toc244209255 \h </w:instrText>
         </w:r>
         <w:r>
           <w:rPr>
@@ -1247,7 +1247,7 @@
           <w14:ligatures w14:val="standardContextual"/>
         </w:rPr>
       </w:pPr>
-      <w:hyperlink w:anchor="_Toc243902376" w:history="1">
+      <w:hyperlink w:anchor="_Toc244209256" w:history="1">
         <w:r>
           <w:rPr>
             <w:rStyle w:val="Hipervnculo"/>
@@ -1274,7 +1274,7 @@
             <w:noProof/>
             <w:webHidden/>
           </w:rPr>
-          <w:instrText xml:space="preserve"> PAGEREF _Toc243902376 \h </w:instrText>
+          <w:instrText xml:space="preserve"> PAGEREF _Toc244209256 \h </w:instrText>
         </w:r>
         <w:r>
           <w:rPr>
@@ -1294,7 +1294,7 @@
             <w:noProof/>
             <w:webHidden/>
           </w:rPr>
-          <w:t>12</w:t>
+          <w:t>13</w:t>
         </w:r>
         <w:r>
           <w:rPr>
@@ -1317,7 +1317,7 @@
           <w14:ligatures w14:val="standardContextual"/>
         </w:rPr>
       </w:pPr>
-      <w:hyperlink w:anchor="_Toc243902377" w:history="1">
+      <w:hyperlink w:anchor="_Toc244209257" w:history="1">
         <w:r>
           <w:rPr>
             <w:rStyle w:val="Hipervnculo"/>
@@ -1344,7 +1344,7 @@
             <w:noProof/>
             <w:webHidden/>
           </w:rPr>
-          <w:instrText xml:space="preserve"> PAGEREF _Toc243902377 \h </w:instrText>
+          <w:instrText xml:space="preserve"> PAGEREF _Toc244209257 \h </w:instrText>
         </w:r>
         <w:r>
           <w:rPr>
@@ -1390,7 +1390,7 @@
           <w14:ligatures w14:val="standardContextual"/>
         </w:rPr>
       </w:pPr>
-      <w:hyperlink w:anchor="_Toc243902378" w:history="1">
+      <w:hyperlink w:anchor="_Toc244209258" w:history="1">
         <w:r>
           <w:rPr>
             <w:rStyle w:val="Hipervnculo"/>
@@ -1417,7 +1417,7 @@
             <w:noProof/>
             <w:webHidden/>
           </w:rPr>
-          <w:instrText xml:space="preserve"> PAGEREF _Toc243902378 \h </w:instrText>
+          <w:instrText xml:space="preserve"> PAGEREF _Toc244209258 \h </w:instrText>
         </w:r>
         <w:r>
           <w:rPr>
@@ -1460,7 +1460,7 @@
           <w14:ligatures w14:val="standardContextual"/>
         </w:rPr>
       </w:pPr>
-      <w:hyperlink w:anchor="_Toc243902379" w:history="1">
+      <w:hyperlink w:anchor="_Toc244209259" w:history="1">
         <w:r>
           <w:rPr>
             <w:rStyle w:val="Hipervnculo"/>
@@ -1487,7 +1487,7 @@
             <w:noProof/>
             <w:webHidden/>
           </w:rPr>
-          <w:instrText xml:space="preserve"> PAGEREF _Toc243902379 \h </w:instrText>
+          <w:instrText xml:space="preserve"> PAGEREF _Toc244209259 \h </w:instrText>
         </w:r>
         <w:r>
           <w:rPr>
@@ -1530,7 +1530,7 @@
           <w14:ligatures w14:val="standardContextual"/>
         </w:rPr>
       </w:pPr>
-      <w:hyperlink w:anchor="_Toc243902380" w:history="1">
+      <w:hyperlink w:anchor="_Toc244209260" w:history="1">
         <w:r>
           <w:rPr>
             <w:rStyle w:val="Hipervnculo"/>
@@ -1557,7 +1557,7 @@
             <w:noProof/>
             <w:webHidden/>
           </w:rPr>
-          <w:instrText xml:space="preserve"> PAGEREF _Toc243902380 \h </w:instrText>
+          <w:instrText xml:space="preserve"> PAGEREF _Toc244209260 \h </w:instrText>
         </w:r>
         <w:r>
           <w:rPr>
@@ -1600,7 +1600,7 @@
           <w14:ligatures w14:val="standardContextual"/>
         </w:rPr>
       </w:pPr>
-      <w:hyperlink w:anchor="_Toc243902381" w:history="1">
+      <w:hyperlink w:anchor="_Toc244209261" w:history="1">
         <w:r>
           <w:rPr>
             <w:rStyle w:val="Hipervnculo"/>
@@ -1627,7 +1627,7 @@
             <w:noProof/>
             <w:webHidden/>
           </w:rPr>
-          <w:instrText xml:space="preserve"> PAGEREF _Toc243902381 \h </w:instrText>
+          <w:instrText xml:space="preserve"> PAGEREF _Toc244209261 \h </w:instrText>
         </w:r>
         <w:r>
           <w:rPr>
@@ -1670,7 +1670,7 @@
           <w14:ligatures w14:val="standardContextual"/>
         </w:rPr>
       </w:pPr>
-      <w:hyperlink w:anchor="_Toc243902382" w:history="1">
+      <w:hyperlink w:anchor="_Toc244209262" w:history="1">
         <w:r>
           <w:rPr>
             <w:rStyle w:val="Hipervnculo"/>
@@ -1697,7 +1697,7 @@
             <w:noProof/>
             <w:webHidden/>
           </w:rPr>
-          <w:instrText xml:space="preserve"> PAGEREF _Toc243902382 \h </w:instrText>
+          <w:instrText xml:space="preserve"> PAGEREF _Toc244209262 \h </w:instrText>
         </w:r>
         <w:r>
           <w:rPr>
@@ -1740,7 +1740,7 @@
           <w14:ligatures w14:val="standardContextual"/>
         </w:rPr>
       </w:pPr>
-      <w:hyperlink w:anchor="_Toc243902383" w:history="1">
+      <w:hyperlink w:anchor="_Toc244209263" w:history="1">
         <w:r>
           <w:rPr>
             <w:rStyle w:val="Hipervnculo"/>
@@ -1767,7 +1767,7 @@
             <w:noProof/>
             <w:webHidden/>
           </w:rPr>
-          <w:instrText xml:space="preserve"> PAGEREF _Toc243902383 \h </w:instrText>
+          <w:instrText xml:space="preserve"> PAGEREF _Toc244209263 \h </w:instrText>
         </w:r>
         <w:r>
           <w:rPr>
@@ -1810,7 +1810,7 @@
           <w14:ligatures w14:val="standardContextual"/>
         </w:rPr>
       </w:pPr>
-      <w:hyperlink w:anchor="_Toc243902384" w:history="1">
+      <w:hyperlink w:anchor="_Toc244209264" w:history="1">
         <w:r>
           <w:rPr>
             <w:rStyle w:val="Hipervnculo"/>
@@ -1837,7 +1837,7 @@
             <w:noProof/>
             <w:webHidden/>
           </w:rPr>
-          <w:instrText xml:space="preserve"> PAGEREF _Toc243902384 \h </w:instrText>
+          <w:instrText xml:space="preserve"> PAGEREF _Toc244209264 \h </w:instrText>
         </w:r>
         <w:r>
           <w:rPr>
@@ -1880,7 +1880,7 @@
           <w14:ligatures w14:val="standardContextual"/>
         </w:rPr>
       </w:pPr>
-      <w:hyperlink w:anchor="_Toc243902385" w:history="1">
+      <w:hyperlink w:anchor="_Toc244209265" w:history="1">
         <w:r>
           <w:rPr>
             <w:rStyle w:val="Hipervnculo"/>
@@ -1907,7 +1907,7 @@
             <w:noProof/>
             <w:webHidden/>
           </w:rPr>
-          <w:instrText xml:space="preserve"> PAGEREF _Toc243902385 \h </w:instrText>
+          <w:instrText xml:space="preserve"> PAGEREF _Toc244209265 \h </w:instrText>
         </w:r>
         <w:r>
           <w:rPr>
@@ -1950,7 +1950,7 @@
           <w14:ligatures w14:val="standardContextual"/>
         </w:rPr>
       </w:pPr>
-      <w:hyperlink w:anchor="_Toc243902386" w:history="1">
+      <w:hyperlink w:anchor="_Toc244209266" w:history="1">
         <w:r>
           <w:rPr>
             <w:rStyle w:val="Hipervnculo"/>
@@ -1977,7 +1977,7 @@
             <w:noProof/>
             <w:webHidden/>
           </w:rPr>
-          <w:instrText xml:space="preserve"> PAGEREF _Toc243902386 \h </w:instrText>
+          <w:instrText xml:space="preserve"> PAGEREF _Toc244209266 \h </w:instrText>
         </w:r>
         <w:r>
           <w:rPr>
@@ -2020,7 +2020,7 @@
           <w14:ligatures w14:val="standardContextual"/>
         </w:rPr>
       </w:pPr>
-      <w:hyperlink w:anchor="_Toc243902387" w:history="1">
+      <w:hyperlink w:anchor="_Toc244209267" w:history="1">
         <w:r>
           <w:rPr>
             <w:rStyle w:val="Hipervnculo"/>
@@ -2047,7 +2047,7 @@
             <w:noProof/>
             <w:webHidden/>
           </w:rPr>
-          <w:instrText xml:space="preserve"> PAGEREF _Toc243902387 \h </w:instrText>
+          <w:instrText xml:space="preserve"> PAGEREF _Toc244209267 \h </w:instrText>
         </w:r>
         <w:r>
           <w:rPr>
@@ -2090,7 +2090,7 @@
           <w14:ligatures w14:val="standardContextual"/>
         </w:rPr>
       </w:pPr>
-      <w:hyperlink w:anchor="_Toc243902388" w:history="1">
+      <w:hyperlink w:anchor="_Toc244209268" w:history="1">
         <w:r>
           <w:rPr>
             <w:rStyle w:val="Hipervnculo"/>
@@ -2117,7 +2117,7 @@
             <w:noProof/>
             <w:webHidden/>
           </w:rPr>
-          <w:instrText xml:space="preserve"> PAGEREF _Toc243902388 \h </w:instrText>
+          <w:instrText xml:space="preserve"> PAGEREF _Toc244209268 \h </w:instrText>
         </w:r>
         <w:r>
           <w:rPr>
@@ -2163,7 +2163,7 @@
           <w14:ligatures w14:val="standardContextual"/>
         </w:rPr>
       </w:pPr>
-      <w:hyperlink w:anchor="_Toc243902389" w:history="1">
+      <w:hyperlink w:anchor="_Toc244209269" w:history="1">
         <w:r>
           <w:rPr>
             <w:rStyle w:val="Hipervnculo"/>
@@ -2190,7 +2190,7 @@
             <w:noProof/>
             <w:webHidden/>
           </w:rPr>
-          <w:instrText xml:space="preserve"> PAGEREF _Toc243902389 \h </w:instrText>
+          <w:instrText xml:space="preserve"> PAGEREF _Toc244209269 \h </w:instrText>
         </w:r>
         <w:r>
           <w:rPr>
@@ -2244,10 +2244,28 @@
           <w:bCs/>
         </w:rPr>
         <w:lastRenderedPageBreak/>
+        <w:t>Actualización 2.3.0 preparada (2026-10-29):</w:t>
+      </w:r>
+      <w:r>
+        <w:t xml:space="preserve"> correcciones de la prueba del dueño, 96 HU, 467 RE, 127 RN y 65 tablas; migración 15 repetible. Escribe Codex; revisa Claude. Producción se confirma al desplegar.</w:t>
+      </w:r>
+    </w:p>
+    <w:p>
+      <w:pPr>
+        <w:pStyle w:val="Textodebloque"/>
+      </w:pPr>
+      <w:r>
+        <w:rPr>
+          <w:b/>
+          <w:bCs/>
+        </w:rPr>
         <w:t>Cierre M0-S — 2026-10-25:</w:t>
       </w:r>
       <w:r>
-        <w:t xml:space="preserve"> versión 2.1.0 preparada para revisión e integración; HU-0.5 implementada, 96 HU, 464 RE, 126 RN y 65 tablas. Migraciones 12/13, Inicio del administrador (HU-6.2) y panel financiero de plataforma. D8/D10 pendientes antes de dinero real.</w:t>
+        <w:t xml:space="preserve"> </w:t>
+      </w:r>
+      <w:r>
+        <w:t>versión 2.1.0 preparada para revisión e integración; HU-0.5 implementada, 96 HU, 464 RE, 126 RN y 65 tablas. Migraciones 12/13, Inicio del administrador (HU-6.2) y panel financiero de plataforma. D8/D10 pendientes antes de dinero real.</w:t>
       </w:r>
     </w:p>
     <w:p>
@@ -2361,7 +2379,7 @@
         <w:pStyle w:val="Ttulo1"/>
       </w:pPr>
       <w:bookmarkStart w:id="0" w:name="_2169bb510914396473aa1c71ab8bc09f79b86cc"/>
-      <w:bookmarkStart w:id="1" w:name="_Toc243902364"/>
+      <w:bookmarkStart w:id="1" w:name="_Toc244209244"/>
       <w:r>
         <w:lastRenderedPageBreak/>
         <w:t>Aislamiento multi-inquilino</w:t>
@@ -2716,7 +2734,7 @@
         <w:pStyle w:val="Ttulo1"/>
       </w:pPr>
       <w:bookmarkStart w:id="2" w:name="_73c0ee2683bf723e155dc341c5b673c8a0cee0f"/>
-      <w:bookmarkStart w:id="3" w:name="_Toc243902365"/>
+      <w:bookmarkStart w:id="3" w:name="_Toc244209245"/>
       <w:bookmarkEnd w:id="0"/>
       <w:r>
         <w:lastRenderedPageBreak/>
@@ -2757,8 +2775,8 @@
           <w:noProof/>
         </w:rPr>
         <w:drawing>
-          <wp:inline distT="0" distB="0" distL="0" distR="0" wp14:anchorId="23C00D4A" wp14:editId="19CA87B5">
-            <wp:extent cx="5939999" cy="1304134"/>
+          <wp:inline distT="0" distB="0" distL="0" distR="0" wp14:anchorId="5B8BAB8D" wp14:editId="5B8BAB8E">
+            <wp:extent cx="5939999" cy="1313653"/>
             <wp:effectExtent l="0" t="0" r="0" b="0"/>
             <wp:docPr id="14" name="Picture"/>
             <wp:cNvGraphicFramePr/>
@@ -2766,7 +2784,7 @@
               <a:graphicData uri="http://schemas.openxmlformats.org/drawingml/2006/picture">
                 <pic:pic xmlns:pic="http://schemas.openxmlformats.org/drawingml/2006/picture">
                   <pic:nvPicPr>
-                    <pic:cNvPr id="15" name="Picture" descr="C:\Users\Usuario\AppData\Local\Temp\zooki-docs-kz6Frr\mer-figura-1.png"/>
+                    <pic:cNvPr id="15" name="Picture" descr="C:\Users\Usuario\AppData\Local\Temp\zooki-docs-KjUzZL\mer-figura-1.png"/>
                     <pic:cNvPicPr>
                       <a:picLocks noChangeAspect="1" noChangeArrowheads="1"/>
                     </pic:cNvPicPr>
@@ -2780,7 +2798,7 @@
                   <pic:spPr bwMode="auto">
                     <a:xfrm>
                       <a:off x="0" y="0"/>
-                      <a:ext cx="5939999" cy="1304134"/>
+                      <a:ext cx="5939999" cy="1313653"/>
                     </a:xfrm>
                     <a:prstGeom prst="rect">
                       <a:avLst/>
@@ -2804,7 +2822,7 @@
         <w:pStyle w:val="Ttulo1"/>
       </w:pPr>
       <w:bookmarkStart w:id="4" w:name="_175abadf9b0a49af33d36e1016fa2ba4e3dbee1"/>
-      <w:bookmarkStart w:id="5" w:name="_Toc243902366"/>
+      <w:bookmarkStart w:id="5" w:name="_Toc244209246"/>
       <w:bookmarkEnd w:id="2"/>
       <w:r>
         <w:lastRenderedPageBreak/>
@@ -2817,7 +2835,7 @@
         <w:pStyle w:val="Ttulo2"/>
       </w:pPr>
       <w:bookmarkStart w:id="6" w:name="_c2b7a8b81ef31c74ab584612d4a9fe9e5f481bc"/>
-      <w:bookmarkStart w:id="7" w:name="_Toc243902367"/>
+      <w:bookmarkStart w:id="7" w:name="_Toc244209247"/>
       <w:r>
         <w:t>1. Plataforma y suscripción (SaaS) — nuevo</w:t>
       </w:r>
@@ -2941,7 +2959,7 @@
         <w:t>plazo_reasignacion_min</w:t>
       </w:r>
       <w:r>
-        <w:t xml:space="preserve"> (10, RN-428) y </w:t>
+        <w:t xml:space="preserve"> (10, RN-428) </w:t>
       </w:r>
       <w:r>
         <w:rPr>
@@ -2950,7 +2968,19 @@
         <w:t>umbral_aviso_min</w:t>
       </w:r>
       <w:r>
-        <w:t xml:space="preserve"> (15, RN-429).</w:t>
+        <w:t xml:space="preserve"> (15, RN-429) y </w:t>
+      </w:r>
+      <w:r>
+        <w:rPr>
+          <w:rStyle w:val="VerbatimChar"/>
+        </w:rPr>
+        <w:t>anticipacion_cambios_min</w:t>
+      </w:r>
+      <w:r>
+        <w:t xml:space="preserve"> </w:t>
+      </w:r>
+      <w:r>
+        <w:t>(30, rango 0–1440, 0 desactiva; RN-430).</w:t>
       </w:r>
     </w:p>
     <w:p>
@@ -2979,10 +3009,7 @@
         <w:t>global</w:t>
       </w:r>
       <w:r>
-        <w:t xml:space="preserve"> </w:t>
-      </w:r>
-      <w:r>
-        <w:t>de planes (gratuito y profesional) con sus precios (mensual/anual) y límites (</w:t>
+        <w:t xml:space="preserve"> de planes (gratuito y profesional) con sus precios (mensual/anual) y límites (</w:t>
       </w:r>
       <w:r>
         <w:rPr>
@@ -3100,7 +3127,7 @@
         <w:pStyle w:val="Ttulo2"/>
       </w:pPr>
       <w:bookmarkStart w:id="8" w:name="_d6a9bf6cf0bb3e49f1d107fe570f8a5ddfe3adf"/>
-      <w:bookmarkStart w:id="9" w:name="_Toc243902368"/>
+      <w:bookmarkStart w:id="9" w:name="_Toc244209248"/>
       <w:bookmarkEnd w:id="6"/>
       <w:r>
         <w:t>2. Acceso y usuarios</w:t>
@@ -3838,7 +3865,7 @@
         <w:pStyle w:val="Ttulo2"/>
       </w:pPr>
       <w:bookmarkStart w:id="10" w:name="_1eb549e2a9c91af4bfaebaeb7bc947a2e39f25e"/>
-      <w:bookmarkStart w:id="11" w:name="_Toc243902369"/>
+      <w:bookmarkStart w:id="11" w:name="_Toc244209249"/>
       <w:bookmarkEnd w:id="8"/>
       <w:r>
         <w:t>3. Reputación de veterinarios — nuevo</w:t>
@@ -3954,7 +3981,7 @@
         <w:pStyle w:val="Ttulo2"/>
       </w:pPr>
       <w:bookmarkStart w:id="12" w:name="_fa59eaf9d7724395b60f4af2c2b485b4008604a"/>
-      <w:bookmarkStart w:id="13" w:name="_Toc243902370"/>
+      <w:bookmarkStart w:id="13" w:name="_Toc244209250"/>
       <w:bookmarkEnd w:id="10"/>
       <w:r>
         <w:t>4. Grafo de conocimiento clínico (Grafo I) — nuevo, global</w:t>
@@ -4245,7 +4272,7 @@
         <w:pStyle w:val="Ttulo2"/>
       </w:pPr>
       <w:bookmarkStart w:id="14" w:name="_6eeb017515ec0d317c46fe31a59e3575da4b41c"/>
-      <w:bookmarkStart w:id="15" w:name="_Toc243902371"/>
+      <w:bookmarkStart w:id="15" w:name="_Toc244209251"/>
       <w:bookmarkEnd w:id="12"/>
       <w:r>
         <w:t>5. Pacientes y catálogos taxonómicos</w:t>
@@ -4737,7 +4764,7 @@
         <w:pStyle w:val="Ttulo2"/>
       </w:pPr>
       <w:bookmarkStart w:id="16" w:name="_d2e8a251732834f58b38cf075788a677d355bc0"/>
-      <w:bookmarkStart w:id="17" w:name="_Toc243902372"/>
+      <w:bookmarkStart w:id="17" w:name="_Toc244209252"/>
       <w:bookmarkEnd w:id="14"/>
       <w:r>
         <w:t>6. Operación clínica</w:t>
@@ -5059,7 +5086,19 @@
         <w:t>pausable</w:t>
       </w:r>
       <w:r>
-        <w:t xml:space="preserve"> indica si una cita de ese tipo puede interrumpirse por una urgencia (RN-427).</w:t>
+        <w:t xml:space="preserve"> indica si puede interrumpirse por urgencia (RN-427). </w:t>
+      </w:r>
+      <w:r>
+        <w:rPr>
+          <w:rStyle w:val="VerbatimChar"/>
+        </w:rPr>
+        <w:t>solo_personal</w:t>
+      </w:r>
+      <w:r>
+        <w:t xml:space="preserve"> </w:t>
+      </w:r>
+      <w:r>
+        <w:t>(booleano, default 0) excluye el tipo del portal y de sus POST. Cirugía programada viene con duración 120, margen 15, pausable=0 y solo_personal=1. La migración 15 agrega ese tipo donde falta sin sobreescribir personalizaciones; pendientes de verificación reciben los siete tipos juntos al activar.</w:t>
       </w:r>
     </w:p>
     <w:p>
@@ -5088,10 +5127,7 @@
         <w:t>recurrente</w:t>
       </w:r>
       <w:r>
-        <w:t xml:space="preserve"> </w:t>
-      </w:r>
-      <w:r>
-        <w:t>de cada veterinario por clínica (</w:t>
+        <w:t xml:space="preserve"> de cada veterinario por clínica (</w:t>
       </w:r>
       <w:r>
         <w:rPr>
@@ -5164,7 +5200,10 @@
         <w:t>fecha_hora_fin</w:t>
       </w:r>
       <w:r>
-        <w:t xml:space="preserve"> exclusiva, en la zona horaria de la clínica; un día completo va de las 00:00 de ese día a las 00:00 del siguiente. </w:t>
+        <w:t xml:space="preserve"> </w:t>
+      </w:r>
+      <w:r>
+        <w:t xml:space="preserve">exclusiva, en la zona horaria de la clínica; un día completo va de las 00:00 de ese día a las 00:00 del siguiente. </w:t>
       </w:r>
       <w:r>
         <w:rPr>
@@ -5183,10 +5222,7 @@
         <w:t>ausencia del titular + cobertura del reemplazo</w:t>
       </w:r>
       <w:r>
-        <w:t xml:space="preserve"> </w:t>
-      </w:r>
-      <w:r>
-        <w:t>(reasignación de sus citas). La trazabilidad de quién atendió realmente la da la historia clínica, no la agenda.</w:t>
+        <w:t xml:space="preserve"> (reasignación de sus citas). La trazabilidad de quién atendió realmente la da la historia clínica, no la agenda.</w:t>
       </w:r>
     </w:p>
     <w:p>
@@ -5339,6 +5375,7 @@
           <w:b/>
           <w:bCs/>
         </w:rPr>
+        <w:lastRenderedPageBreak/>
         <w:t>consultas</w:t>
       </w:r>
       <w:r>
@@ -5407,11 +5444,7 @@
         <w:t>consulta_sintomas</w:t>
       </w:r>
       <w:r>
-        <w:t xml:space="preserve"> guarda </w:t>
-      </w:r>
-      <w:r>
-        <w:lastRenderedPageBreak/>
-        <w:t xml:space="preserve">los síntomas registrados en la consulta, a partir de los cuales el Grafo I sugiere diagnósticos (RN-210). </w:t>
+        <w:t xml:space="preserve"> guarda los síntomas registrados en la consulta, a partir de los cuales el Grafo I sugiere diagnósticos (RN-210). </w:t>
       </w:r>
       <w:r>
         <w:rPr>
@@ -5474,7 +5507,7 @@
         <w:pStyle w:val="Ttulo2"/>
       </w:pPr>
       <w:bookmarkStart w:id="18" w:name="_d717dda87a0fa1125b482ed50a29711e040ab78"/>
-      <w:bookmarkStart w:id="19" w:name="_Toc243902373"/>
+      <w:bookmarkStart w:id="19" w:name="_Toc244209253"/>
       <w:bookmarkEnd w:id="16"/>
       <w:r>
         <w:t>7. Prevención</w:t>
@@ -5516,10 +5549,7 @@
         <w:t>id_clinica</w:t>
       </w:r>
       <w:r>
-        <w:t xml:space="preserve"> </w:t>
-      </w:r>
-      <w:r>
-        <w:t>y el veterinario que lo aplicó, para mostrar en el carnet y en la historia compartida qué clínica lo hizo (RN-112).</w:t>
+        <w:t xml:space="preserve"> y el veterinario que lo aplicó, para mostrar en el carnet y en la historia compartida qué clínica lo hizo (RN-112).</w:t>
       </w:r>
     </w:p>
     <w:p>
@@ -5558,7 +5588,10 @@
         <w:t>productos_desparasitacion_base</w:t>
       </w:r>
       <w:r>
-        <w:t xml:space="preserve">: Catálogos configurables </w:t>
+        <w:t>: Catálogos configurables</w:t>
+      </w:r>
+      <w:r>
+        <w:t xml:space="preserve"> </w:t>
       </w:r>
       <w:r>
         <w:rPr>
@@ -5622,7 +5655,7 @@
         <w:pStyle w:val="Ttulo2"/>
       </w:pPr>
       <w:bookmarkStart w:id="20" w:name="_0560edb7cb7205277d9e3cd97c31da13d513556"/>
-      <w:bookmarkStart w:id="21" w:name="_Toc243902374"/>
+      <w:bookmarkStart w:id="21" w:name="_Toc244209254"/>
       <w:bookmarkEnd w:id="18"/>
       <w:r>
         <w:t>8. Comunicaciones y auditoría</w:t>
@@ -5699,7 +5732,10 @@
         <w:t>id_clinica</w:t>
       </w:r>
       <w:r>
-        <w:t xml:space="preserve"> es NULL en los avisos de la plataforma que no pertenecen a una clínica: escaneo del carnet, cambio de correo o de documento.</w:t>
+        <w:t xml:space="preserve"> </w:t>
+      </w:r>
+      <w:r>
+        <w:t>es NULL en los avisos de la plataforma que no pertenecen a una clínica: escaneo del carnet, cambio de correo o de documento.</w:t>
       </w:r>
     </w:p>
     <w:p>
@@ -5736,10 +5772,7 @@
         <w:t>vigente_hasta</w:t>
       </w:r>
       <w:r>
-        <w:t xml:space="preserve"> </w:t>
-      </w:r>
-      <w:r>
-        <w:t>marca desde cuándo deja de mostrarse (NULL: no caduca).</w:t>
+        <w:t xml:space="preserve"> marca desde cuándo deja de mostrarse (NULL: no caduca).</w:t>
       </w:r>
     </w:p>
     <w:p>
@@ -5813,7 +5846,7 @@
         <w:pStyle w:val="Ttulo2"/>
       </w:pPr>
       <w:bookmarkStart w:id="22" w:name="_cb1741f9772febdbdca46263dec4ffd4ce97a2d"/>
-      <w:bookmarkStart w:id="23" w:name="_Toc243902375"/>
+      <w:bookmarkStart w:id="23" w:name="_Toc244209255"/>
       <w:bookmarkEnd w:id="20"/>
       <w:r>
         <w:t>9. Infraestructura</w:t>
@@ -5880,9 +5913,10 @@
         <w:pStyle w:val="Ttulo2"/>
       </w:pPr>
       <w:bookmarkStart w:id="24" w:name="_aa4390657bf3d36805eb33834f45f17803989a9"/>
-      <w:bookmarkStart w:id="25" w:name="_Toc243902376"/>
+      <w:bookmarkStart w:id="25" w:name="_Toc244209256"/>
       <w:bookmarkEnd w:id="22"/>
       <w:r>
+        <w:lastRenderedPageBreak/>
         <w:t>10. Índices y restricciones</w:t>
       </w:r>
       <w:bookmarkEnd w:id="25"/>
@@ -5917,7 +5951,6 @@
           <w:b/>
           <w:bCs/>
         </w:rPr>
-        <w:lastRenderedPageBreak/>
         <w:t>Unicidad:</w:t>
       </w:r>
       <w:r>
@@ -6076,10 +6109,7 @@
         <w:t>consultas</w:t>
       </w:r>
       <w:r>
-        <w:t>,</w:t>
-      </w:r>
-      <w:r>
-        <w:t xml:space="preserve"> </w:t>
+        <w:t xml:space="preserve">, </w:t>
       </w:r>
       <w:r>
         <w:rPr>
@@ -6261,7 +6291,7 @@
         <w:pStyle w:val="Ttulo2"/>
       </w:pPr>
       <w:bookmarkStart w:id="26" w:name="_0695c15f10912553d4a763a83c28506dc90b60d"/>
-      <w:bookmarkStart w:id="27" w:name="_Toc243902377"/>
+      <w:bookmarkStart w:id="27" w:name="_Toc244209257"/>
       <w:bookmarkEnd w:id="24"/>
       <w:r>
         <w:t>Ampliación del Grafo I — M2 B1</w:t>
@@ -6282,10 +6312,7 @@
         <w:t>grafo_reglas</w:t>
       </w:r>
       <w:r>
-        <w:t xml:space="preserve"> conserva condiciones y resultado declarativos; el evaluador pertenece a C2, no a B1. </w:t>
-      </w:r>
-      <w:r>
-        <w:t xml:space="preserve">El nodo de especie referencia solo </w:t>
+        <w:t xml:space="preserve"> conserva condiciones y resultado declarativos; el evaluador pertenece a C2, no a B1. El nodo de especie referencia solo </w:t>
       </w:r>
       <w:r>
         <w:rPr>
@@ -6312,7 +6339,10 @@
         <w:t>razas</w:t>
       </w:r>
       <w:r>
-        <w:t xml:space="preserve">. Las FK, la unicidad y </w:t>
+        <w:t xml:space="preserve">. </w:t>
+      </w:r>
+      <w:r>
+        <w:t xml:space="preserve">Las FK, la unicidad y </w:t>
       </w:r>
       <w:r>
         <w:rPr>
@@ -6348,10 +6378,7 @@
         <w:t>citas.contexto_triage</w:t>
       </w:r>
       <w:r>
-        <w:t xml:space="preserve"> </w:t>
-      </w:r>
-      <w:r>
-        <w:t xml:space="preserve">conservan contexto estructurado, sin interpretar notas ni copiar medicación protegida. El tipo </w:t>
+        <w:t xml:space="preserve"> conservan contexto estructurado, sin interpretar notas ni copiar medicación protegida. El tipo </w:t>
       </w:r>
       <w:r>
         <w:rPr>
@@ -6360,7 +6387,10 @@
         <w:t>sustancia</w:t>
       </w:r>
       <w:r>
-        <w:t xml:space="preserve"> distingue tóxicos de fármacos; ningún signo negativo implica por sí solo un bloqueo.</w:t>
+        <w:t xml:space="preserve"> </w:t>
+      </w:r>
+      <w:r>
+        <w:t>distingue tóxicos de fármacos; ningún signo negativo implica por sí solo un bloqueo.</w:t>
       </w:r>
     </w:p>
     <w:p>
@@ -6368,7 +6398,7 @@
         <w:pStyle w:val="Ttulo1"/>
       </w:pPr>
       <w:bookmarkStart w:id="28" w:name="_058de8aead850e46a9e586eb30e954c5388acf5"/>
-      <w:bookmarkStart w:id="29" w:name="_Toc243902378"/>
+      <w:bookmarkStart w:id="29" w:name="_Toc244209258"/>
       <w:bookmarkEnd w:id="4"/>
       <w:bookmarkEnd w:id="26"/>
       <w:r>
@@ -6382,10 +6412,10 @@
         <w:pStyle w:val="FirstParagraph"/>
       </w:pPr>
       <w:r>
-        <w:t xml:space="preserve">El destino amplía seis entidades y reutiliza las existentes; las siete tablas inicialmente sugeridas en A no se adoptan en bloque. Evaluación, derivación y espera se unifican en solicitudes_agenda, con estado de revisión separado del estado de atención. </w:t>
-      </w:r>
-      <w:r>
-        <w:t>Citas mantiene id_veterinario obligatorio; una espera sin profesional aún no es una cita. Toda nueva entidad se confina por id_clinica y conserva sus datos al inactivar; ninguna FK nueva borra actos clínicos en cascada. Las FK compuestas de recurso+clínica evitan vincular recursos de clínicas diferentes; ser miembro activo y su rol se revalida en servidor.</w:t>
+        <w:t xml:space="preserve">El destino amplía seis entidades y reutiliza las existentes; las siete tablas inicialmente sugeridas en A no se adoptan en bloque. Evaluación, derivación y espera se unifican en solicitudes_agenda, con estado de revisión separado del estado de atención. Citas mantiene id_veterinario obligatorio; una espera sin profesional aún no es una cita. </w:t>
+      </w:r>
+      <w:r>
+        <w:t>Toda nueva entidad se confina por id_clinica y conserva sus datos al inactivar; ninguna FK nueva borra actos clínicos en cascada. Las FK compuestas de recurso+clínica evitan vincular recursos de clínicas diferentes; ser miembro activo y su rol se revalida en servidor.</w:t>
       </w:r>
     </w:p>
     <w:p>
@@ -6393,7 +6423,7 @@
         <w:pStyle w:val="Ttulo2"/>
       </w:pPr>
       <w:bookmarkStart w:id="30" w:name="_5dfb73a1c63ec79cf51c48637fca30228f2abc9"/>
-      <w:bookmarkStart w:id="31" w:name="_Toc243902379"/>
+      <w:bookmarkStart w:id="31" w:name="_Toc244209259"/>
       <w:r>
         <w:t>cierres_clinica — esquema preparado B2, flujo pendiente</w:t>
       </w:r>
@@ -6753,10 +6783,7 @@
         <w:t>Relaciones:</w:t>
       </w:r>
       <w:r>
-        <w:t xml:space="preserve"> </w:t>
-      </w:r>
-      <w:r>
-        <w:t xml:space="preserve">id_clinica → clinicas(id_clinica); id_autor → usuarios(id_usuario). </w:t>
+        <w:t xml:space="preserve"> id_clinica → clinicas(id_clinica); id_autor → usuarios(id_usuario). </w:t>
       </w:r>
       <w:r>
         <w:rPr>
@@ -6766,7 +6793,10 @@
         <w:t>Restricciones y transición:</w:t>
       </w:r>
       <w:r>
-        <w:t xml:space="preserve"> fin&gt;inicio; [inicio,fin); baja lógica, sin borrar cierres usados. Transición: vacía, no inventar festivos.</w:t>
+        <w:t xml:space="preserve"> </w:t>
+      </w:r>
+      <w:r>
+        <w:t>fin&gt;inicio; [inicio,fin); baja lógica, sin borrar cierres usados. Transición: vacía, no inventar festivos.</w:t>
       </w:r>
     </w:p>
     <w:p>
@@ -6774,7 +6804,7 @@
         <w:pStyle w:val="Ttulo2"/>
       </w:pPr>
       <w:bookmarkStart w:id="32" w:name="_4e42805c06e3eb1dc8f257eed8018622891e1bc"/>
-      <w:bookmarkStart w:id="33" w:name="_Toc243902380"/>
+      <w:bookmarkStart w:id="33" w:name="_Toc244209260"/>
       <w:bookmarkEnd w:id="30"/>
       <w:r>
         <w:t>bloques_agenda — esquema preparado B2, flujo pendiente</w:t>
@@ -7136,10 +7166,10 @@
         <w:t>Relaciones:</w:t>
       </w:r>
       <w:r>
-        <w:t xml:space="preserve"> </w:t>
-      </w:r>
-      <w:r>
-        <w:t xml:space="preserve">id_clinica → clinicas(id_clinica); id_veterinario → usuarios(id_usuario); id_veterinario,id_clinica → usuario_clinica(id_usuario,id_clinica). </w:t>
+        <w:t xml:space="preserve"> id_clinica → clinicas(id_clinica); id_veterinario → usuarios(id_usuario); id_veterinario,id_clinica → usuario_clinica(id_usuario,id_clinica).</w:t>
+      </w:r>
+      <w:r>
+        <w:t xml:space="preserve"> </w:t>
       </w:r>
       <w:r>
         <w:rPr>
@@ -7149,10 +7179,7 @@
         <w:t>Restricciones y transición:</w:t>
       </w:r>
       <w:r>
-        <w:t xml:space="preserve"> </w:t>
-      </w:r>
-      <w:r>
-        <w:t>Identificador opaco servidor de franja original; no cambia por recortes de ausencia ni se borra/recrea para regalar cupo. Cambios recurrentes preservan bloque ya usado de esa fecha, marcan revisar y no reinician contador. Contar citas naranja salvo cancelada/no_asistio; no persistir contador duplicado ni tope histórico distinto al parámetro vigente. Transición: vacía; sobrecupos legados sin origen demostrable se marcan pendientes.</w:t>
+        <w:t xml:space="preserve"> Identificador opaco servidor de franja original; no cambia por recortes de ausencia ni se borra/recrea para regalar cupo. Cambios recurrentes preservan bloque ya usado de esa fecha, marcan revisar y no reinician contador. Contar citas naranja salvo cancelada/no_asistio; no persistir contador duplicado ni tope histórico distinto al parámetro vigente. Transición: vacía; sobrecupos legados sin origen demostrable se marcan pendientes.</w:t>
       </w:r>
     </w:p>
     <w:p>
@@ -7160,7 +7187,7 @@
         <w:pStyle w:val="Ttulo2"/>
       </w:pPr>
       <w:bookmarkStart w:id="34" w:name="_1b30ee21218e90306ba74dda29388252a8d2db0"/>
-      <w:bookmarkStart w:id="35" w:name="_Toc243902381"/>
+      <w:bookmarkStart w:id="35" w:name="_Toc244209261"/>
       <w:bookmarkEnd w:id="32"/>
       <w:r>
         <w:t>solicitudes_agenda — esquema preparado B2, flujo pendiente</w:t>
@@ -8023,10 +8050,7 @@
         <w:t>Índices:</w:t>
       </w:r>
       <w:r>
-        <w:t xml:space="preserve"> </w:t>
-      </w:r>
-      <w:r>
-        <w:t xml:space="preserve">UNIQUE KEY uq_solicitud_clinica (id_solicitud, id_clinica); UNIQUE KEY uq_solicitud_cita (id_cita); KEY idx_solicitud_espera (id_clinica, estado, fecha_llegada, id_solicitud); KEY idx_solicitud_revision (id_clinica, estado_revision, fecha_registro); KEY idx_solicitud_mascota (id_mascota, estado). </w:t>
+        <w:t xml:space="preserve"> UNIQUE KEY uq_solicitud_clinica (id_solicitud, id_clinica); UNIQUE KEY uq_solicitud_cita (id_cita); KEY idx_solicitud_espera (id_clinica, estado, fecha_llegada, id_solicitud); KEY idx_solicitud_revision (id_clinica, estado_revision, fecha_registro); KEY idx_solicitud_mascota (id_mascota, estado). </w:t>
       </w:r>
       <w:r>
         <w:rPr>
@@ -8063,7 +8087,7 @@
         <w:pStyle w:val="Ttulo2"/>
       </w:pPr>
       <w:bookmarkStart w:id="36" w:name="_e62e85b53d15634eeaa8f30c152885b83328cb0"/>
-      <w:bookmarkStart w:id="37" w:name="_Toc243902382"/>
+      <w:bookmarkStart w:id="37" w:name="_Toc244209262"/>
       <w:bookmarkEnd w:id="34"/>
       <w:r>
         <w:t>pausas_cita — esquema preparado B2, flujo pendiente</w:t>
@@ -8479,7 +8503,7 @@
         <w:pStyle w:val="Ttulo2"/>
       </w:pPr>
       <w:bookmarkStart w:id="38" w:name="_fe2b95b751daa198f833a6a8284905af42e44a7"/>
-      <w:bookmarkStart w:id="39" w:name="_Toc243902383"/>
+      <w:bookmarkStart w:id="39" w:name="_Toc244209263"/>
       <w:bookmarkEnd w:id="36"/>
       <w:r>
         <w:t>operaciones_agenda — esquema preparado B2, flujo pendiente</w:t>
@@ -8898,7 +8922,7 @@
         <w:pStyle w:val="Ttulo2"/>
       </w:pPr>
       <w:bookmarkStart w:id="40" w:name="_7ac5f96d4da7d47ae24959ebd8d2c7a7ef08929"/>
-      <w:bookmarkStart w:id="41" w:name="_Toc243902384"/>
+      <w:bookmarkStart w:id="41" w:name="_Toc244209264"/>
       <w:bookmarkEnd w:id="38"/>
       <w:r>
         <w:t>eventos_agenda — esquema preparado B2, flujo pendiente</w:t>
@@ -9647,7 +9671,7 @@
         <w:pStyle w:val="Ttulo2"/>
       </w:pPr>
       <w:bookmarkStart w:id="42" w:name="_fe13269eaad4c59dd2ee5e983c1129d6bb3ab82"/>
-      <w:bookmarkStart w:id="43" w:name="_Toc243902385"/>
+      <w:bookmarkStart w:id="43" w:name="_Toc244209265"/>
       <w:bookmarkEnd w:id="40"/>
       <w:r>
         <w:t>Ampliaciones de entidades existentes — destino pendiente de B2</w:t>
@@ -10986,7 +11010,7 @@
         <w:pStyle w:val="Ttulo2"/>
       </w:pPr>
       <w:bookmarkStart w:id="44" w:name="_3a65e980d85736d7641056d57f359accf869a9d"/>
-      <w:bookmarkStart w:id="45" w:name="_Toc243902386"/>
+      <w:bookmarkStart w:id="45" w:name="_Toc244209266"/>
       <w:bookmarkEnd w:id="42"/>
       <w:r>
         <w:t>Reconstrucción clínica, contacto y datos legados</w:t>
@@ -11018,7 +11042,7 @@
         <w:pStyle w:val="Ttulo2"/>
       </w:pPr>
       <w:bookmarkStart w:id="46" w:name="_ffd18c9de5c28d309a1408929498ba759a058bc"/>
-      <w:bookmarkStart w:id="47" w:name="_Toc243902387"/>
+      <w:bookmarkStart w:id="47" w:name="_Toc244209267"/>
       <w:bookmarkEnd w:id="44"/>
       <w:r>
         <w:lastRenderedPageBreak/>
@@ -11129,7 +11153,7 @@
         <w:pStyle w:val="Ttulo2"/>
       </w:pPr>
       <w:bookmarkStart w:id="48" w:name="_de63352b645bbd863ded9fb0a9ed3075ae772bf"/>
-      <w:bookmarkStart w:id="49" w:name="_Toc243902388"/>
+      <w:bookmarkStart w:id="49" w:name="_Toc244209268"/>
       <w:bookmarkEnd w:id="46"/>
       <w:r>
         <w:t>Materialización B2 — restricciones de datos (2026-10-18)</w:t>
@@ -11681,7 +11705,7 @@
         <w:pStyle w:val="Ttulo1"/>
       </w:pPr>
       <w:bookmarkStart w:id="50" w:name="_ca4927c5c418f5f0ebf9f3b142ee6f7e4f46426"/>
-      <w:bookmarkStart w:id="51" w:name="_Toc243902389"/>
+      <w:bookmarkStart w:id="51" w:name="_Toc244209269"/>
       <w:bookmarkEnd w:id="28"/>
       <w:bookmarkEnd w:id="48"/>
       <w:r>
@@ -20665,7 +20689,7 @@
               <w:noProof/>
             </w:rPr>
             <w:drawing>
-              <wp:inline distT="0" distB="0" distL="0" distR="0" wp14:anchorId="38AA01D0" wp14:editId="6D146984">
+              <wp:inline distT="0" distB="0" distL="0" distR="0" wp14:anchorId="5B8BAB99" wp14:editId="5B8BAB9A">
                 <wp:extent cx="324000" cy="324000"/>
                 <wp:effectExtent l="0" t="0" r="0" b="0"/>
                 <wp:docPr id="9001" name="Logo Zooki"/>
@@ -20825,7 +20849,7 @@
   <w:abstractNum w:abstractNumId="0" w15:restartNumberingAfterBreak="0">
     <w:nsid w:val="0000A990"/>
     <w:multiLevelType w:val="multilevel"/>
-    <w:tmpl w:val="7616AC12"/>
+    <w:tmpl w:val="2FD43158"/>
     <w:lvl w:ilvl="0">
       <w:numFmt w:val="bullet"/>
       <w:lvlText w:val=" "/>
@@ -20902,7 +20926,7 @@
   <w:abstractNum w:abstractNumId="1" w15:restartNumberingAfterBreak="0">
     <w:nsid w:val="0000A991"/>
     <w:multiLevelType w:val="multilevel"/>
-    <w:tmpl w:val="7862A77C"/>
+    <w:tmpl w:val="B78C0D88"/>
     <w:lvl w:ilvl="0">
       <w:numFmt w:val="bullet"/>
       <w:lvlText w:val=""/>
@@ -21003,40 +21027,40 @@
       </w:rPr>
     </w:lvl>
   </w:abstractNum>
-  <w:num w:numId="1" w16cid:durableId="1698853115">
+  <w:num w:numId="1" w16cid:durableId="1464348937">
     <w:abstractNumId w:val="0"/>
   </w:num>
-  <w:num w:numId="2" w16cid:durableId="292560301">
+  <w:num w:numId="2" w16cid:durableId="1050302743">
     <w:abstractNumId w:val="1"/>
   </w:num>
-  <w:num w:numId="3" w16cid:durableId="886524836">
+  <w:num w:numId="3" w16cid:durableId="1995253675">
     <w:abstractNumId w:val="1"/>
   </w:num>
-  <w:num w:numId="4" w16cid:durableId="1621839331">
+  <w:num w:numId="4" w16cid:durableId="1949387756">
     <w:abstractNumId w:val="1"/>
   </w:num>
-  <w:num w:numId="5" w16cid:durableId="681861985">
+  <w:num w:numId="5" w16cid:durableId="1104614776">
     <w:abstractNumId w:val="1"/>
   </w:num>
-  <w:num w:numId="6" w16cid:durableId="702630838">
+  <w:num w:numId="6" w16cid:durableId="1884710111">
     <w:abstractNumId w:val="1"/>
   </w:num>
-  <w:num w:numId="7" w16cid:durableId="1373268723">
+  <w:num w:numId="7" w16cid:durableId="1036929292">
     <w:abstractNumId w:val="1"/>
   </w:num>
-  <w:num w:numId="8" w16cid:durableId="1105224409">
+  <w:num w:numId="8" w16cid:durableId="1681858146">
     <w:abstractNumId w:val="1"/>
   </w:num>
-  <w:num w:numId="9" w16cid:durableId="812141676">
+  <w:num w:numId="9" w16cid:durableId="519011138">
     <w:abstractNumId w:val="1"/>
   </w:num>
-  <w:num w:numId="10" w16cid:durableId="550385349">
+  <w:num w:numId="10" w16cid:durableId="245772278">
     <w:abstractNumId w:val="1"/>
   </w:num>
-  <w:num w:numId="11" w16cid:durableId="858393784">
+  <w:num w:numId="11" w16cid:durableId="183248374">
     <w:abstractNumId w:val="1"/>
   </w:num>
-  <w:num w:numId="12" w16cid:durableId="1235626053">
+  <w:num w:numId="12" w16cid:durableId="763383697">
     <w:abstractNumId w:val="1"/>
   </w:num>
 </w:numbering>

</xml_diff>